<commit_message>
Embed twelve illustrated B4 Science maps and refresh teaching pack
Co-authored-by: arena-agent <297053741+arena-agent@users.noreply.github.com>
</commit_message>
<xml_diff>
--- a/deliverables/term1-batch2-science-b4-b5/files/START_HERE_Batch_2_Science_B4_B5.docx
+++ b/deliverables/term1-batch2-science-b4-b5/files/START_HERE_Batch_2_Science_B4_B5.docx
@@ -313,6 +313,19 @@
     <w:p>
       <w:r>
         <w:t>Automated checks verify DOCX package integrity, counts, four distinct options and one keyed answer, map embedding, and test numbering. They do not independently validate every scientific statement, teaching suitability, accessibility or Word pagination. See QUALITY_CHECKS.json for the exact check results. All documents remain teacher-review drafts.</w:t>
+      </w:r>
+    </w:p>
+    <w:p>
+      <w:pPr>
+        <w:pStyle w:val="Heading1"/>
+      </w:pPr>
+      <w:r>
+        <w:t>Illustrated-map revision — B4 Science</w:t>
+      </w:r>
+    </w:p>
+    <w:p>
+      <w:r>
+        <w:t>All twelve B4 Science maps are now illustrated and embedded in the weekly book. The same images are supplied as standalone PNGs. B5 maps in this archive remain text-based, pending revision. Batch 1 remains unchanged. AI-generated artwork has received editorial corrections but still requires teacher review. Lessons, questions, tests and separate answer keys are unchanged.</w:t>
       </w:r>
     </w:p>
     <w:sectPr>

</xml_diff>

<commit_message>
Illustrate all twelve B5 Science maps and refresh combined pack
Co-authored-by: arena-agent <297053741+arena-agent@users.noreply.github.com>
</commit_message>
<xml_diff>
--- a/deliverables/term1-batch2-science-b4-b5/files/START_HERE_Batch_2_Science_B4_B5.docx
+++ b/deliverables/term1-batch2-science-b4-b5/files/START_HERE_Batch_2_Science_B4_B5.docx
@@ -320,12 +320,12 @@
         <w:pStyle w:val="Heading1"/>
       </w:pPr>
       <w:r>
-        <w:t>Illustrated-map revision — B4 Science</w:t>
+        <w:t>Illustrated-map revision — B4 and B5 Science</w:t>
       </w:r>
     </w:p>
     <w:p>
       <w:r>
-        <w:t>All twelve B4 Science maps are now illustrated and embedded in the weekly book. The same images are supplied as standalone PNGs. B5 maps in this archive remain text-based, pending revision. Batch 1 remains unchanged. AI-generated artwork has received editorial corrections but still requires teacher review. Lessons, questions, tests and separate answer keys are unchanged.</w:t>
+        <w:t>All 24 B4 and B5 Science weekly maps are now illustrated and embedded in the respective weekly Word books, with matching standalone PNGs. B5 Week 11 reuses the reviewed plant-parts artwork; B5 Week 12 uses the approved bean/maize preview. Batch 1 remains unchanged. AI-generated artwork requires teacher review. Lesson text, questions, tests and separate answer keys are unchanged.</w:t>
       </w:r>
     </w:p>
     <w:sectPr>

</xml_diff>